<commit_message>
Milestone 02: tenant seam - control plane, per-hospital databases, fleet scripts
</commit_message>
<xml_diff>
--- a/docs/DEV_GUIDE_01 - Milestone - Scaffold, Shared Library and Verified Plumbing.docx
+++ b/docs/DEV_GUIDE_01 - Milestone - Scaffold, Shared Library and Verified Plumbing.docx
@@ -2179,7 +2179,7 @@
           <w:sz w:val="21"/>
           <w:szCs w:val="21"/>
         </w:rPr>
-        <w:t xml:space="preserve">Five files were carried across from the SiteSilo CMS. Recording the changes matters because the unchanged files should stay unchanged: when SiteSilo fixes something in one of them, the fix applies here too.</w:t>
+        <w:t xml:space="preserve">Five files were carried across from the SiteSilo CMS. This table is a historical record of where they came from — it is not a standing link. The HMS does not track SiteSilo and is not expected to stay in step with it: anything listed here can be changed the moment the HMS has a reason to. The provenance is recorded so that a later reader understands why a file looks the way it does, not to constrain it.</w:t>
       </w:r>
     </w:p>
     <w:tbl>
@@ -2256,7 +2256,7 @@
                 <w:sz w:val="17"/>
                 <w:szCs w:val="17"/>
               </w:rPr>
-              <w:t xml:space="preserve">Change on the way across</w:t>
+              <w:t xml:space="preserve">State when carried across</w:t>
             </w:r>
           </w:p>
         </w:tc>

</xml_diff>